<commit_message>
chore(release): finalize latency notes, soften ablation claim, and clean up validate_release imports
</commit_message>
<xml_diff>
--- a/Report_SER_NgoXuanKien_Template.docx
+++ b/Report_SER_NgoXuanKien_Template.docx
@@ -210,19 +210,19 @@
         <w:t xml:space="preserve"> </w:t>
       </w:r>
       <w:r>
-        <w:t xml:space="preserve">margins. Ablation studies confirm that both acoustic and linguistic streams</w:t>
-      </w:r>
-      <w:r>
-        <w:t xml:space="preserve"> </w:t>
-      </w:r>
-      <w:r>
-        <w:t xml:space="preserve">contribute to DFAT’s superiority, with the linguistic stream providing the</w:t>
-      </w:r>
-      <w:r>
-        <w:t xml:space="preserve"> </w:t>
-      </w:r>
-      <w:r>
-        <w:t xml:space="preserve">largest gains for acoustically ambiguous classes.</w:t>
+        <w:t xml:space="preserve">margins. Ablation studies confirm that the linguistic stream serves as a valuable</w:t>
+      </w:r>
+      <w:r>
+        <w:t xml:space="preserve"> </w:t>
+      </w:r>
+      <w:r>
+        <w:t xml:space="preserve">supplementary signal in early-fusion setups, though late stream-level fusion is not</w:t>
+      </w:r>
+      <w:r>
+        <w:t xml:space="preserve"> </w:t>
+      </w:r>
+      <w:r>
+        <w:t xml:space="preserve">unconditionally superior to acoustic-only baselines.</w:t>
       </w:r>
     </w:p>
     <w:bookmarkStart w:id="27" w:name="acknowledgements"/>
@@ -3449,7 +3449,7 @@
         <w:t xml:space="preserve">Interpretation</w:t>
       </w:r>
       <w:r>
-        <w:t xml:space="preserve">: The WavLM acoustic branch acts as the primary discriminative anchor. Removing the audio branch (Linguistic-only) drops performance dramatically, proving that ASR text alone is vastly insufficient to determine emotion. However, their combination creates a system superior to both. Furthermore, downgrading Whisper-small to Whisper-tiny drops the linguistic performance precipitously, confirming that the entire fusion pipeline’s success is highly dependent on the quality of the ASR transcript.</w:t>
+        <w:t xml:space="preserve">: The WavLM acoustic branch acts as the primary discriminative anchor. Removing the audio branch (Linguistic-only) drops performance dramatically, proving that ASR text alone is vastly insufficient to determine emotion. While the heavily optimized full DFAT pipeline achieves state-of-the-art results, simple uncalibrated fusion (Early Fusion at 0.3995 or stream-level Late Fusion at 0.3408) can actually underperform the acoustic-only baseline (0.4329). This indicates that the linguistic stream acts best as a supplementary signal rather than an independent equal, and highlights the difficulty of fusing modalities when the ASR text is noisy. Furthermore, downgrading Whisper-small to Whisper-tiny drops the linguistic performance precipitously, confirming that fusion success is highly dependent on the quality of the ASR transcript.</w:t>
       </w:r>
     </w:p>
     <w:bookmarkEnd w:id="53"/>

</xml_diff>